<commit_message>
Add Git evidence and update README
</commit_message>
<xml_diff>
--- a/BarmBuzz/Doccumentation/README.DOCX.DOCX
+++ b/BarmBuzz/Doccumentation/README.DOCX.DOCX
@@ -3,16 +3,8 @@
 <w:document xmlns:wpc="http://schemas.microsoft.com/office/word/2010/wordprocessingCanvas" xmlns:cx="http://schemas.microsoft.com/office/drawing/2014/chartex" xmlns:cx1="http://schemas.microsoft.com/office/drawing/2015/9/8/chartex" xmlns:cx2="http://schemas.microsoft.com/office/drawing/2015/10/21/chartex" xmlns:cx3="http://schemas.microsoft.com/office/drawing/2016/5/9/chartex" xmlns:cx4="http://schemas.microsoft.com/office/drawing/2016/5/10/chartex" xmlns:cx5="http://schemas.microsoft.com/office/drawing/2016/5/11/chartex" xmlns:cx6="http://schemas.microsoft.com/office/drawing/2016/5/12/chartex" xmlns:cx7="http://schemas.microsoft.com/office/drawing/2016/5/13/chartex" xmlns:cx8="http://schemas.microsoft.com/office/drawing/2016/5/14/chartex" xmlns:mc="http://schemas.openxmlformats.org/markup-compatibility/2006" xmlns:aink="http://schemas.microsoft.com/office/drawing/2016/ink" xmlns:am3d="http://schemas.microsoft.com/office/drawing/2017/model3d" xmlns:o="urn:schemas-microsoft-com:office:office" xmlns:oel="http://schemas.microsoft.com/office/2019/extlst" xmlns:r="http://schemas.openxmlformats.org/officeDocument/2006/relationships" xmlns:m="http://schemas.openxmlformats.org/officeDocument/2006/math" xmlns:v="urn:schemas-microsoft-com:vml" xmlns:wp14="http://schemas.microsoft.com/office/word/2010/wordprocessingDrawing" xmlns:wp="http://schemas.openxmlformats.org/drawingml/2006/wordprocessingDrawing" xmlns:w10="urn:schemas-microsoft-com:office:word" xmlns:w="http://schemas.openxmlformats.org/wordprocessingml/2006/main" xmlns:w14="http://schemas.microsoft.com/office/word/2010/wordml" xmlns:w15="http://schemas.microsoft.com/office/word/2012/wordml" xmlns:w16cex="http://schemas.microsoft.com/office/word/2018/wordml/cex" xmlns:w16cid="http://schemas.microsoft.com/office/word/2016/wordml/cid" xmlns:w16="http://schemas.microsoft.com/office/word/2018/wordml" xmlns:w16du="http://schemas.microsoft.com/office/word/2023/wordml/word16du" xmlns:w16sdtdh="http://schemas.microsoft.com/office/word/2020/wordml/sdtdatahash" xmlns:w16sdtfl="http://schemas.microsoft.com/office/word/2024/wordml/sdtformatlock" xmlns:w16se="http://schemas.microsoft.com/office/word/2015/wordml/symex" xmlns:wpg="http://schemas.microsoft.com/office/word/2010/wordprocessingGroup" xmlns:wpi="http://schemas.microsoft.com/office/word/2010/wordprocessingInk" xmlns:wne="http://schemas.microsoft.com/office/word/2006/wordml" xmlns:wps="http://schemas.microsoft.com/office/word/2010/wordprocessingShape" mc:Ignorable="w14 w15 w16se w16cid w16 w16cex w16sdtdh w16sdtfl w16du wp14">
   <w:body>
     <w:p>
-      <w:proofErr w:type="spellStart"/>
-      <w:r>
-        <w:t>Barnbuzz</w:t>
-      </w:r>
-      <w:proofErr w:type="spellEnd"/>
-      <w:r>
-        <w:t xml:space="preserve"> Active Directory Implementation</w:t>
-      </w:r>
-      <w:r>
-        <w:t xml:space="preserve"> – Harry Corcoran </w:t>
+      <w:r>
+        <w:t xml:space="preserve">Barnbuzz Active Directory Implementation – Harry Corcoran </w:t>
       </w:r>
       <w:r>
         <w:t>Student ID: 2403986</w:t>
@@ -26,58 +18,19 @@
     <w:p/>
     <w:p>
       <w:r>
-        <w:t xml:space="preserve">This implementation builds a </w:t>
-      </w:r>
-      <w:proofErr w:type="gramStart"/>
-      <w:r>
-        <w:t>2 domain</w:t>
-      </w:r>
-      <w:proofErr w:type="gramEnd"/>
-      <w:r>
-        <w:t xml:space="preserve"> active directory forest for </w:t>
-      </w:r>
-      <w:proofErr w:type="spellStart"/>
-      <w:r>
-        <w:t>Barnbuzz</w:t>
-      </w:r>
-      <w:proofErr w:type="spellEnd"/>
-      <w:r>
-        <w:t xml:space="preserve"> which has:</w:t>
-      </w:r>
-    </w:p>
-    <w:p/>
-    <w:p>
-      <w:r>
-        <w:t>Root Domain: '</w:t>
-      </w:r>
-      <w:proofErr w:type="spellStart"/>
-      <w:proofErr w:type="gramStart"/>
-      <w:r>
-        <w:t>bolton.local</w:t>
-      </w:r>
-      <w:proofErr w:type="spellEnd"/>
-      <w:proofErr w:type="gramEnd"/>
-      <w:r>
-        <w:t>'</w:t>
-      </w:r>
-    </w:p>
-    <w:p/>
-    <w:p>
-      <w:r>
-        <w:t>Child Domain: '</w:t>
-      </w:r>
-      <w:proofErr w:type="spellStart"/>
-      <w:proofErr w:type="gramStart"/>
-      <w:r>
-        <w:t>derby.bolton</w:t>
-      </w:r>
-      <w:proofErr w:type="gramEnd"/>
-      <w:r>
-        <w:t>.local</w:t>
-      </w:r>
-      <w:proofErr w:type="spellEnd"/>
-      <w:r>
-        <w:t>'</w:t>
+        <w:t>This implementation builds a 2 domain active directory forest for Barnbuzz which has:</w:t>
+      </w:r>
+    </w:p>
+    <w:p/>
+    <w:p>
+      <w:r>
+        <w:t>Root Domain: 'bolton.local'</w:t>
+      </w:r>
+    </w:p>
+    <w:p/>
+    <w:p>
+      <w:r>
+        <w:t>Child Domain: 'derby.bolton.local'</w:t>
       </w:r>
     </w:p>
     <w:p/>
@@ -106,36 +59,13 @@
     <w:p/>
     <w:p>
       <w:r>
-        <w:t>'</w:t>
-      </w:r>
-      <w:proofErr w:type="spellStart"/>
-      <w:proofErr w:type="gramStart"/>
-      <w:r>
-        <w:t>bolton.local</w:t>
-      </w:r>
-      <w:proofErr w:type="spellEnd"/>
-      <w:proofErr w:type="gramEnd"/>
-      <w:r>
-        <w:t>' is the company's HQ</w:t>
-      </w:r>
-    </w:p>
-    <w:p/>
-    <w:p>
-      <w:r>
-        <w:t>'</w:t>
-      </w:r>
-      <w:proofErr w:type="spellStart"/>
-      <w:proofErr w:type="gramStart"/>
-      <w:r>
-        <w:t>derby.bolton</w:t>
-      </w:r>
-      <w:proofErr w:type="gramEnd"/>
-      <w:r>
-        <w:t>.local</w:t>
-      </w:r>
-      <w:proofErr w:type="spellEnd"/>
-      <w:r>
-        <w:t>' is the child domain with delegated administration</w:t>
+        <w:t>'bolton.local' is the company's HQ</w:t>
+      </w:r>
+    </w:p>
+    <w:p/>
+    <w:p>
+      <w:r>
+        <w:t>'derby.bolton.local' is the child domain with delegated administration</w:t>
       </w:r>
     </w:p>
     <w:p/>
@@ -147,15 +77,7 @@
     <w:p/>
     <w:p>
       <w:r>
-        <w:t xml:space="preserve">This design shows that domains are security boundaries whereas OUs aren't, e.g. Bolton users can auth in </w:t>
-      </w:r>
-      <w:proofErr w:type="gramStart"/>
-      <w:r>
-        <w:t>Derby</w:t>
-      </w:r>
-      <w:proofErr w:type="gramEnd"/>
-      <w:r>
-        <w:t xml:space="preserve"> but they don't have access to everything; it's based on permissions that are needed specifically.</w:t>
+        <w:t>This design shows that domains are security boundaries whereas OUs aren't, e.g. Bolton users can auth in Derby but they don't have access to everything; it's based on permissions that are needed specifically.</w:t>
       </w:r>
     </w:p>
     <w:p/>
@@ -168,29 +90,13 @@
     <w:p/>
     <w:p>
       <w:r>
-        <w:t>'</w:t>
-      </w:r>
-      <w:proofErr w:type="spellStart"/>
-      <w:r>
-        <w:t>BoltonUsers</w:t>
-      </w:r>
-      <w:proofErr w:type="spellEnd"/>
-      <w:r>
-        <w:t>' – contains users from root forest domain</w:t>
-      </w:r>
-    </w:p>
-    <w:p/>
-    <w:p>
-      <w:r>
-        <w:t>'</w:t>
-      </w:r>
-      <w:proofErr w:type="spellStart"/>
-      <w:r>
-        <w:t>DerbyAccessGroup</w:t>
-      </w:r>
-      <w:proofErr w:type="spellEnd"/>
-      <w:r>
-        <w:t>' – controls access to Derby file shares</w:t>
+        <w:t>'BoltonUsers' – contains users from root forest domain</w:t>
+      </w:r>
+    </w:p>
+    <w:p/>
+    <w:p>
+      <w:r>
+        <w:t>'DerbyAccessGroup' – controls access to Derby file shares</w:t>
       </w:r>
     </w:p>
     <w:p/>
@@ -237,13 +143,8 @@
     </w:p>
     <w:p/>
     <w:p>
-      <w:proofErr w:type="spellStart"/>
-      <w:r>
-        <w:t>BarmBuzz</w:t>
-      </w:r>
-      <w:proofErr w:type="spellEnd"/>
-      <w:r>
-        <w:t>/</w:t>
+      <w:r>
+        <w:t>BarmBuzz/</w:t>
       </w:r>
     </w:p>
     <w:p>
@@ -426,15 +327,7 @@
         <w:t>──</w:t>
       </w:r>
       <w:r>
-        <w:t xml:space="preserve"> </w:t>
-      </w:r>
-      <w:proofErr w:type="spellStart"/>
-      <w:r>
-        <w:t>HealthChecks</w:t>
-      </w:r>
-      <w:proofErr w:type="spellEnd"/>
-      <w:r>
-        <w:t>/</w:t>
+        <w:t xml:space="preserve"> HealthChecks/</w:t>
       </w:r>
     </w:p>
     <w:p>
@@ -451,15 +344,7 @@
         <w:t>──</w:t>
       </w:r>
       <w:r>
-        <w:t xml:space="preserve"> </w:t>
-      </w:r>
-      <w:proofErr w:type="spellStart"/>
-      <w:r>
-        <w:t>GPOBackups</w:t>
-      </w:r>
-      <w:proofErr w:type="spellEnd"/>
-      <w:r>
-        <w:t>/</w:t>
+        <w:t xml:space="preserve"> GPOBackups/</w:t>
       </w:r>
     </w:p>
     <w:p>
@@ -498,15 +383,7 @@
     </w:p>
     <w:p>
       <w:r>
-        <w:t xml:space="preserve">└── </w:t>
-      </w:r>
-      <w:proofErr w:type="spellStart"/>
-      <w:r>
-        <w:t>AI_Log</w:t>
-      </w:r>
-      <w:proofErr w:type="spellEnd"/>
-      <w:r>
-        <w:t>/</w:t>
+        <w:t>└── AI_Log/</w:t>
       </w:r>
     </w:p>
     <w:p/>
@@ -546,84 +423,21 @@
     </w:p>
     <w:p/>
     <w:p>
-      <w:proofErr w:type="spellStart"/>
-      <w:r>
-        <w:t>WinClient</w:t>
-      </w:r>
-      <w:proofErr w:type="spellEnd"/>
-      <w:r>
-        <w:t>: '192.168.50.100' (static or DHCP reserved also works)</w:t>
-      </w:r>
-    </w:p>
-    <w:p/>
-    <w:p>
-      <w:r>
-        <w:t xml:space="preserve">2. DC-Bolton to promote it to domain controller </w:t>
-      </w:r>
-      <w:proofErr w:type="gramStart"/>
-      <w:r>
-        <w:t>with in</w:t>
-      </w:r>
-      <w:proofErr w:type="gramEnd"/>
-      <w:r>
-        <w:t xml:space="preserve"> PowerShell run:</w:t>
+      <w:r>
+        <w:t>WinClient: '192.168.50.100' (static or DHCP reserved also works)</w:t>
+      </w:r>
+    </w:p>
+    <w:p/>
+    <w:p>
+      <w:r>
+        <w:t>2. DC-Bolton to promote it to domain controller with in PowerShell run:</w:t>
       </w:r>
     </w:p>
     <w:p/>
     <w:p>
       <w:r>
         <w:lastRenderedPageBreak/>
-        <w:t>Install-</w:t>
-      </w:r>
-      <w:proofErr w:type="spellStart"/>
-      <w:r>
-        <w:t>ADDSForest</w:t>
-      </w:r>
-      <w:proofErr w:type="spellEnd"/>
-      <w:r>
-        <w:t xml:space="preserve"> -</w:t>
-      </w:r>
-      <w:proofErr w:type="spellStart"/>
-      <w:r>
-        <w:t>DomainName</w:t>
-      </w:r>
-      <w:proofErr w:type="spellEnd"/>
-      <w:r>
-        <w:t xml:space="preserve"> "</w:t>
-      </w:r>
-      <w:proofErr w:type="spellStart"/>
-      <w:proofErr w:type="gramStart"/>
-      <w:r>
-        <w:t>bolton.local</w:t>
-      </w:r>
-      <w:proofErr w:type="spellEnd"/>
-      <w:proofErr w:type="gramEnd"/>
-      <w:r>
-        <w:t>" -</w:t>
-      </w:r>
-      <w:proofErr w:type="spellStart"/>
-      <w:r>
-        <w:t>SafeModeAdministratorPassword</w:t>
-      </w:r>
-      <w:proofErr w:type="spellEnd"/>
-      <w:r>
-        <w:t xml:space="preserve"> (</w:t>
-      </w:r>
-      <w:proofErr w:type="spellStart"/>
-      <w:r>
-        <w:t>ConvertTo-SecureString</w:t>
-      </w:r>
-      <w:proofErr w:type="spellEnd"/>
-      <w:r>
-        <w:t xml:space="preserve"> "P@ssw0rd123!" -</w:t>
-      </w:r>
-      <w:proofErr w:type="spellStart"/>
-      <w:r>
-        <w:t>AsPlainText</w:t>
-      </w:r>
-      <w:proofErr w:type="spellEnd"/>
-      <w:r>
-        <w:t xml:space="preserve"> -Force) -Force</w:t>
+        <w:t>Install-ADDSForest -DomainName "bolton.local" -SafeModeAdministratorPassword (ConvertTo-SecureString "P@ssw0rd123!" -AsPlainText -Force) -Force</w:t>
       </w:r>
     </w:p>
     <w:p/>
@@ -640,91 +454,12 @@
     </w:p>
     <w:p>
       <w:r>
-        <w:t>Install-</w:t>
-      </w:r>
-      <w:proofErr w:type="spellStart"/>
-      <w:r>
-        <w:t>WindowsFeature</w:t>
-      </w:r>
-      <w:proofErr w:type="spellEnd"/>
-      <w:r>
-        <w:t xml:space="preserve"> -Name AD-Domain-Services -</w:t>
-      </w:r>
-      <w:proofErr w:type="spellStart"/>
-      <w:r>
-        <w:t>IncludeManagementTools</w:t>
-      </w:r>
-      <w:proofErr w:type="spellEnd"/>
-    </w:p>
-    <w:p>
-      <w:r>
-        <w:t>Install-</w:t>
-      </w:r>
-      <w:proofErr w:type="spellStart"/>
-      <w:r>
-        <w:t>ADDSDomain</w:t>
-      </w:r>
-      <w:proofErr w:type="spellEnd"/>
-      <w:r>
-        <w:t xml:space="preserve"> -</w:t>
-      </w:r>
-      <w:proofErr w:type="spellStart"/>
-      <w:r>
-        <w:t>NewDomainName</w:t>
-      </w:r>
-      <w:proofErr w:type="spellEnd"/>
-      <w:r>
-        <w:t xml:space="preserve"> "derby" -</w:t>
-      </w:r>
-      <w:proofErr w:type="spellStart"/>
-      <w:r>
-        <w:t>ParentDomainName</w:t>
-      </w:r>
-      <w:proofErr w:type="spellEnd"/>
-      <w:r>
-        <w:t xml:space="preserve"> "</w:t>
-      </w:r>
-      <w:proofErr w:type="spellStart"/>
-      <w:proofErr w:type="gramStart"/>
-      <w:r>
-        <w:t>bolton.local</w:t>
-      </w:r>
-      <w:proofErr w:type="spellEnd"/>
-      <w:proofErr w:type="gramEnd"/>
-      <w:r>
-        <w:t>" -</w:t>
-      </w:r>
-      <w:proofErr w:type="spellStart"/>
-      <w:r>
-        <w:t>SafeModeAdministratorPassword</w:t>
-      </w:r>
-      <w:proofErr w:type="spellEnd"/>
-      <w:r>
-        <w:t xml:space="preserve"> (</w:t>
-      </w:r>
-      <w:proofErr w:type="spellStart"/>
-      <w:r>
-        <w:t>ConvertTo-SecureString</w:t>
-      </w:r>
-      <w:proofErr w:type="spellEnd"/>
-      <w:r>
-        <w:t xml:space="preserve"> "P@ssw0rd123!" -</w:t>
-      </w:r>
-      <w:proofErr w:type="spellStart"/>
-      <w:r>
-        <w:t>AsPlainText</w:t>
-      </w:r>
-      <w:proofErr w:type="spellEnd"/>
-      <w:r>
-        <w:t xml:space="preserve"> -Force) -Credential (Get-Credential "</w:t>
-      </w:r>
-      <w:proofErr w:type="spellStart"/>
-      <w:r>
-        <w:t>administrator@bolton.local</w:t>
-      </w:r>
-      <w:proofErr w:type="spellEnd"/>
-      <w:r>
-        <w:t>") -Force</w:t>
+        <w:t>Install-WindowsFeature -Name AD-Domain-Services -IncludeManagementTools</w:t>
+      </w:r>
+    </w:p>
+    <w:p>
+      <w:r>
+        <w:t>Install-ADDSDomain -NewDomainName "derby" -ParentDomainName "bolton.local" -SafeModeAdministratorPassword (ConvertTo-SecureString "P@ssw0rd123!" -AsPlainText -Force) -Credential (Get-Credential "administrator@bolton.local") -Force</w:t>
       </w:r>
     </w:p>
     <w:p/>
@@ -735,35 +470,7 @@
     </w:p>
     <w:p>
       <w:r>
-        <w:t>New-</w:t>
-      </w:r>
-      <w:proofErr w:type="spellStart"/>
-      <w:r>
-        <w:t>ADOrganizationalUnit</w:t>
-      </w:r>
-      <w:proofErr w:type="spellEnd"/>
-      <w:r>
-        <w:t xml:space="preserve"> -Name "Nottingham" -Path "DC=</w:t>
-      </w:r>
-      <w:proofErr w:type="spellStart"/>
-      <w:proofErr w:type="gramStart"/>
-      <w:r>
-        <w:t>derby,DC</w:t>
-      </w:r>
-      <w:proofErr w:type="spellEnd"/>
-      <w:proofErr w:type="gramEnd"/>
-      <w:r>
-        <w:t>=</w:t>
-      </w:r>
-      <w:proofErr w:type="spellStart"/>
-      <w:proofErr w:type="gramStart"/>
-      <w:r>
-        <w:t>bolton,DC</w:t>
-      </w:r>
-      <w:proofErr w:type="spellEnd"/>
-      <w:proofErr w:type="gramEnd"/>
-      <w:r>
-        <w:t>=local"</w:t>
+        <w:t>New-ADOrganizationalUnit -Name "Nottingham" -Path "DC=derby,DC=bolton,DC=local"</w:t>
       </w:r>
     </w:p>
     <w:p/>
@@ -779,165 +486,17 @@
     </w:p>
     <w:p>
       <w:r>
-        <w:t>New-</w:t>
-      </w:r>
-      <w:proofErr w:type="spellStart"/>
-      <w:r>
-        <w:t>ADUser</w:t>
-      </w:r>
-      <w:proofErr w:type="spellEnd"/>
-      <w:r>
-        <w:t xml:space="preserve"> -Name "BoltonUser" -</w:t>
-      </w:r>
-      <w:proofErr w:type="spellStart"/>
-      <w:r>
-        <w:t>SamAccountName</w:t>
-      </w:r>
-      <w:proofErr w:type="spellEnd"/>
-      <w:r>
-        <w:t xml:space="preserve"> "</w:t>
-      </w:r>
-      <w:proofErr w:type="spellStart"/>
-      <w:r>
-        <w:t>boltonuser</w:t>
-      </w:r>
-      <w:proofErr w:type="spellEnd"/>
-      <w:r>
-        <w:t>" -</w:t>
-      </w:r>
-      <w:proofErr w:type="spellStart"/>
-      <w:r>
-        <w:t>UserPrincipalName</w:t>
-      </w:r>
-      <w:proofErr w:type="spellEnd"/>
-      <w:r>
-        <w:t xml:space="preserve"> "</w:t>
-      </w:r>
-      <w:proofErr w:type="spellStart"/>
-      <w:r>
-        <w:t>boltonuser@bolton.local</w:t>
-      </w:r>
-      <w:proofErr w:type="spellEnd"/>
-      <w:r>
-        <w:t>" -</w:t>
-      </w:r>
-      <w:proofErr w:type="spellStart"/>
-      <w:r>
-        <w:t>GivenName</w:t>
-      </w:r>
-      <w:proofErr w:type="spellEnd"/>
-      <w:r>
-        <w:t xml:space="preserve"> "Bolton" -Surname "User" -Enabled $true -</w:t>
-      </w:r>
-      <w:proofErr w:type="spellStart"/>
-      <w:r>
-        <w:t>AccountPassword</w:t>
-      </w:r>
-      <w:proofErr w:type="spellEnd"/>
-      <w:r>
-        <w:t xml:space="preserve"> (</w:t>
-      </w:r>
-      <w:proofErr w:type="spellStart"/>
-      <w:r>
-        <w:t>ConvertTo-SecureString</w:t>
-      </w:r>
-      <w:proofErr w:type="spellEnd"/>
-      <w:r>
-        <w:t xml:space="preserve"> "Password123!" -</w:t>
-      </w:r>
-      <w:proofErr w:type="spellStart"/>
-      <w:r>
-        <w:t>AsPlainText</w:t>
-      </w:r>
-      <w:proofErr w:type="spellEnd"/>
-      <w:r>
-        <w:t xml:space="preserve"> -Force)</w:t>
-      </w:r>
-    </w:p>
-    <w:p>
-      <w:r>
-        <w:t>New-</w:t>
-      </w:r>
-      <w:proofErr w:type="spellStart"/>
-      <w:r>
-        <w:t>ADGroup</w:t>
-      </w:r>
-      <w:proofErr w:type="spellEnd"/>
-      <w:r>
-        <w:t xml:space="preserve"> -Name "</w:t>
-      </w:r>
-      <w:proofErr w:type="spellStart"/>
-      <w:r>
-        <w:t>BoltonUsers</w:t>
-      </w:r>
-      <w:proofErr w:type="spellEnd"/>
-      <w:r>
-        <w:t>" -</w:t>
-      </w:r>
-      <w:proofErr w:type="spellStart"/>
-      <w:r>
-        <w:t>GroupScope</w:t>
-      </w:r>
-      <w:proofErr w:type="spellEnd"/>
-      <w:r>
-        <w:t xml:space="preserve"> Global -</w:t>
-      </w:r>
-      <w:proofErr w:type="spellStart"/>
-      <w:r>
-        <w:t>GroupCategory</w:t>
-      </w:r>
-      <w:proofErr w:type="spellEnd"/>
-      <w:r>
-        <w:t xml:space="preserve"> Security -Path "CN=</w:t>
-      </w:r>
-      <w:proofErr w:type="spellStart"/>
-      <w:proofErr w:type="gramStart"/>
-      <w:r>
-        <w:t>Users,DC</w:t>
-      </w:r>
-      <w:proofErr w:type="spellEnd"/>
-      <w:proofErr w:type="gramEnd"/>
-      <w:r>
-        <w:t>=</w:t>
-      </w:r>
-      <w:proofErr w:type="spellStart"/>
-      <w:proofErr w:type="gramStart"/>
-      <w:r>
-        <w:t>bolton,DC</w:t>
-      </w:r>
-      <w:proofErr w:type="spellEnd"/>
-      <w:proofErr w:type="gramEnd"/>
-      <w:r>
-        <w:t>=local"</w:t>
-      </w:r>
-    </w:p>
-    <w:p>
-      <w:r>
-        <w:t>Add-</w:t>
-      </w:r>
-      <w:proofErr w:type="spellStart"/>
-      <w:r>
-        <w:t>ADGroupMember</w:t>
-      </w:r>
-      <w:proofErr w:type="spellEnd"/>
-      <w:r>
-        <w:t xml:space="preserve"> -Identity "</w:t>
-      </w:r>
-      <w:proofErr w:type="spellStart"/>
-      <w:r>
-        <w:t>BoltonUsers</w:t>
-      </w:r>
-      <w:proofErr w:type="spellEnd"/>
-      <w:r>
-        <w:t>" -Members "</w:t>
-      </w:r>
-      <w:proofErr w:type="spellStart"/>
-      <w:r>
-        <w:t>boltonuser</w:t>
-      </w:r>
-      <w:proofErr w:type="spellEnd"/>
-      <w:r>
-        <w:t>"</w:t>
+        <w:t>New-ADUser -Name "BoltonUser" -SamAccountName "boltonuser" -UserPrincipalName "boltonuser@bolton.local" -GivenName "Bolton" -Surname "User" -Enabled $true -AccountPassword (ConvertTo-SecureString "Password123!" -AsPlainText -Force)</w:t>
+      </w:r>
+    </w:p>
+    <w:p>
+      <w:r>
+        <w:t>New-ADGroup -Name "BoltonUsers" -GroupScope Global -GroupCategory Security -Path "CN=Users,DC=bolton,DC=local"</w:t>
+      </w:r>
+    </w:p>
+    <w:p>
+      <w:r>
+        <w:t>Add-ADGroupMember -Identity "BoltonUsers" -Members "boltonuser"</w:t>
       </w:r>
     </w:p>
     <w:p/>
@@ -948,184 +507,18 @@
     </w:p>
     <w:p>
       <w:r>
-        <w:t>New-</w:t>
-      </w:r>
-      <w:proofErr w:type="spellStart"/>
-      <w:r>
-        <w:t>ADUser</w:t>
-      </w:r>
-      <w:proofErr w:type="spellEnd"/>
-      <w:r>
-        <w:t xml:space="preserve"> -Name "</w:t>
-      </w:r>
-      <w:proofErr w:type="spellStart"/>
-      <w:r>
-        <w:t>DerbyUser</w:t>
-      </w:r>
-      <w:proofErr w:type="spellEnd"/>
-      <w:r>
-        <w:t>" -</w:t>
-      </w:r>
-      <w:proofErr w:type="spellStart"/>
-      <w:r>
-        <w:t>SamAccountName</w:t>
-      </w:r>
-      <w:proofErr w:type="spellEnd"/>
-      <w:r>
-        <w:t xml:space="preserve"> "</w:t>
-      </w:r>
-      <w:proofErr w:type="spellStart"/>
-      <w:r>
-        <w:t>derbyuser</w:t>
-      </w:r>
-      <w:proofErr w:type="spellEnd"/>
-      <w:r>
-        <w:t>" -</w:t>
-      </w:r>
-      <w:proofErr w:type="spellStart"/>
-      <w:r>
-        <w:t>UserPrincipalName</w:t>
-      </w:r>
-      <w:proofErr w:type="spellEnd"/>
-      <w:r>
-        <w:t xml:space="preserve"> "</w:t>
-      </w:r>
-      <w:proofErr w:type="spellStart"/>
-      <w:r>
-        <w:t>derbyuser@derby.bolton.local</w:t>
-      </w:r>
-      <w:proofErr w:type="spellEnd"/>
-      <w:r>
-        <w:t>" -</w:t>
-      </w:r>
-      <w:proofErr w:type="spellStart"/>
-      <w:r>
-        <w:t>GivenName</w:t>
-      </w:r>
-      <w:proofErr w:type="spellEnd"/>
-      <w:r>
-        <w:t xml:space="preserve"> "Derby" -Surname "User" -Enabled $true -</w:t>
-      </w:r>
-      <w:proofErr w:type="spellStart"/>
-      <w:r>
-        <w:t>AccountPassword</w:t>
-      </w:r>
-      <w:proofErr w:type="spellEnd"/>
-      <w:r>
-        <w:t xml:space="preserve"> (</w:t>
-      </w:r>
-      <w:proofErr w:type="spellStart"/>
-      <w:r>
-        <w:t>ConvertTo-SecureString</w:t>
-      </w:r>
-      <w:proofErr w:type="spellEnd"/>
-      <w:r>
-        <w:t xml:space="preserve"> "Password123!" -</w:t>
-      </w:r>
-      <w:proofErr w:type="spellStart"/>
-      <w:r>
-        <w:t>AsPlainText</w:t>
-      </w:r>
-      <w:proofErr w:type="spellEnd"/>
-      <w:r>
-        <w:t xml:space="preserve"> -Force)</w:t>
-      </w:r>
-    </w:p>
-    <w:p>
-      <w:r>
-        <w:t>New-</w:t>
-      </w:r>
-      <w:proofErr w:type="spellStart"/>
-      <w:r>
-        <w:t>ADGroup</w:t>
-      </w:r>
-      <w:proofErr w:type="spellEnd"/>
-      <w:r>
-        <w:t xml:space="preserve"> -Name "</w:t>
-      </w:r>
-      <w:proofErr w:type="spellStart"/>
-      <w:r>
-        <w:t>DerbyAccessGroup</w:t>
-      </w:r>
-      <w:proofErr w:type="spellEnd"/>
-      <w:r>
-        <w:t>" -</w:t>
-      </w:r>
-      <w:proofErr w:type="spellStart"/>
-      <w:r>
-        <w:t>GroupScope</w:t>
-      </w:r>
-      <w:proofErr w:type="spellEnd"/>
-      <w:r>
-        <w:t xml:space="preserve"> Global -</w:t>
-      </w:r>
-      <w:proofErr w:type="spellStart"/>
-      <w:r>
-        <w:t>GroupCategory</w:t>
-      </w:r>
-      <w:proofErr w:type="spellEnd"/>
-      <w:r>
-        <w:t xml:space="preserve"> Security -Path "CN=</w:t>
-      </w:r>
-      <w:proofErr w:type="spellStart"/>
-      <w:proofErr w:type="gramStart"/>
-      <w:r>
-        <w:t>Users,DC</w:t>
-      </w:r>
-      <w:proofErr w:type="spellEnd"/>
-      <w:proofErr w:type="gramEnd"/>
-      <w:r>
-        <w:t>=</w:t>
-      </w:r>
-      <w:proofErr w:type="spellStart"/>
-      <w:proofErr w:type="gramStart"/>
-      <w:r>
-        <w:t>derby,DC</w:t>
-      </w:r>
-      <w:proofErr w:type="spellEnd"/>
-      <w:proofErr w:type="gramEnd"/>
-      <w:r>
-        <w:t>=</w:t>
-      </w:r>
-      <w:proofErr w:type="spellStart"/>
-      <w:proofErr w:type="gramStart"/>
-      <w:r>
-        <w:t>bolton,DC</w:t>
-      </w:r>
-      <w:proofErr w:type="spellEnd"/>
-      <w:proofErr w:type="gramEnd"/>
-      <w:r>
-        <w:t>=local"</w:t>
+        <w:t>New-ADUser -Name "DerbyUser" -SamAccountName "derbyuser" -UserPrincipalName "derbyuser@derby.bolton.local" -GivenName "Derby" -Surname "User" -Enabled $true -AccountPassword (ConvertTo-SecureString "Password123!" -AsPlainText -Force)</w:t>
+      </w:r>
+    </w:p>
+    <w:p>
+      <w:r>
+        <w:t>New-ADGroup -Name "DerbyAccessGroup" -GroupScope Global -GroupCategory Security -Path "CN=Users,DC=derby,DC=bolton,DC=local"</w:t>
       </w:r>
     </w:p>
     <w:p>
       <w:r>
         <w:lastRenderedPageBreak/>
-        <w:t>Add-</w:t>
-      </w:r>
-      <w:proofErr w:type="spellStart"/>
-      <w:r>
-        <w:t>ADGroupMember</w:t>
-      </w:r>
-      <w:proofErr w:type="spellEnd"/>
-      <w:r>
-        <w:t xml:space="preserve"> -Identity "</w:t>
-      </w:r>
-      <w:proofErr w:type="spellStart"/>
-      <w:r>
-        <w:t>DerbyAccessGroup</w:t>
-      </w:r>
-      <w:proofErr w:type="spellEnd"/>
-      <w:r>
-        <w:t>" -Members "</w:t>
-      </w:r>
-      <w:proofErr w:type="spellStart"/>
-      <w:r>
-        <w:t>derbyuser</w:t>
-      </w:r>
-      <w:proofErr w:type="spellEnd"/>
-      <w:r>
-        <w:t>"</w:t>
+        <w:t>Add-ADGroupMember -Identity "DerbyAccessGroup" -Members "derbyuser"</w:t>
       </w:r>
     </w:p>
     <w:p/>
@@ -1147,145 +540,38 @@
     </w:p>
     <w:p>
       <w:r>
-        <w:t>$</w:t>
-      </w:r>
-      <w:proofErr w:type="spellStart"/>
-      <w:r>
-        <w:t>acl</w:t>
-      </w:r>
-      <w:proofErr w:type="spellEnd"/>
-      <w:r>
-        <w:t xml:space="preserve"> = Get-</w:t>
-      </w:r>
-      <w:proofErr w:type="spellStart"/>
-      <w:r>
-        <w:t>Acl</w:t>
-      </w:r>
-      <w:proofErr w:type="spellEnd"/>
-      <w:r>
-        <w:t xml:space="preserve"> "C:\Shares\Confidential"</w:t>
-      </w:r>
-    </w:p>
-    <w:p>
-      <w:r>
-        <w:t>$</w:t>
-      </w:r>
-      <w:proofErr w:type="spellStart"/>
-      <w:proofErr w:type="gramStart"/>
-      <w:r>
-        <w:t>acl.SetAccessRuleProtection</w:t>
-      </w:r>
-      <w:proofErr w:type="spellEnd"/>
-      <w:proofErr w:type="gramEnd"/>
-      <w:r>
-        <w:t>($true, $false)</w:t>
-      </w:r>
-    </w:p>
-    <w:p>
-      <w:r>
-        <w:t xml:space="preserve">$rule = New-Object </w:t>
-      </w:r>
-      <w:proofErr w:type="gramStart"/>
-      <w:r>
-        <w:t>System.Security.AccessControl.FileSystemAccessRule</w:t>
-      </w:r>
-      <w:proofErr w:type="gramEnd"/>
-      <w:r>
-        <w:t>("DERBY\DerbyAccessGroup", "Modify", "</w:t>
-      </w:r>
-      <w:proofErr w:type="spellStart"/>
-      <w:proofErr w:type="gramStart"/>
-      <w:r>
-        <w:t>ContainerInherit,ObjectInherit</w:t>
-      </w:r>
-      <w:proofErr w:type="spellEnd"/>
-      <w:proofErr w:type="gramEnd"/>
-      <w:r>
-        <w:t>", "None", "Allow")</w:t>
-      </w:r>
-    </w:p>
-    <w:p>
-      <w:r>
-        <w:t>$</w:t>
-      </w:r>
-      <w:proofErr w:type="spellStart"/>
-      <w:proofErr w:type="gramStart"/>
-      <w:r>
-        <w:t>acl.AddAccessRule</w:t>
-      </w:r>
-      <w:proofErr w:type="spellEnd"/>
-      <w:proofErr w:type="gramEnd"/>
-      <w:r>
-        <w:t>($rule)</w:t>
-      </w:r>
-    </w:p>
-    <w:p>
-      <w:r>
-        <w:t>Set-</w:t>
-      </w:r>
-      <w:proofErr w:type="spellStart"/>
-      <w:r>
-        <w:t>Acl</w:t>
-      </w:r>
-      <w:proofErr w:type="spellEnd"/>
-      <w:r>
-        <w:t xml:space="preserve"> -Path "C:\Shares\Confidential" -</w:t>
-      </w:r>
-      <w:proofErr w:type="spellStart"/>
-      <w:r>
-        <w:t>AclObject</w:t>
-      </w:r>
-      <w:proofErr w:type="spellEnd"/>
-      <w:r>
-        <w:t xml:space="preserve"> $</w:t>
-      </w:r>
-      <w:proofErr w:type="spellStart"/>
-      <w:r>
-        <w:t>acl</w:t>
-      </w:r>
-      <w:proofErr w:type="spellEnd"/>
-    </w:p>
-    <w:p>
-      <w:r>
-        <w:t>New-</w:t>
-      </w:r>
-      <w:proofErr w:type="spellStart"/>
-      <w:r>
-        <w:t>SmbShare</w:t>
-      </w:r>
-      <w:proofErr w:type="spellEnd"/>
-      <w:r>
-        <w:t xml:space="preserve"> -Name "Confidential" -Path "C:\Shares\Confidential" -</w:t>
-      </w:r>
-      <w:proofErr w:type="spellStart"/>
-      <w:r>
-        <w:t>FullAccess</w:t>
-      </w:r>
-      <w:proofErr w:type="spellEnd"/>
-      <w:r>
-        <w:t xml:space="preserve"> "DERBY\</w:t>
-      </w:r>
-      <w:proofErr w:type="spellStart"/>
-      <w:r>
-        <w:t>DerbyAccessGroup</w:t>
-      </w:r>
-      <w:proofErr w:type="spellEnd"/>
-      <w:r>
-        <w:t>"</w:t>
-      </w:r>
-    </w:p>
-    <w:p/>
-    <w:p>
-      <w:r>
-        <w:t xml:space="preserve">7.Join </w:t>
-      </w:r>
-      <w:proofErr w:type="spellStart"/>
-      <w:r>
-        <w:t>WinClient</w:t>
-      </w:r>
-      <w:proofErr w:type="spellEnd"/>
-      <w:r>
-        <w:t xml:space="preserve"> to domain and see if it works and test etc (see section 7.)</w:t>
+        <w:t>$acl = Get-Acl "C:\Shares\Confidential"</w:t>
+      </w:r>
+    </w:p>
+    <w:p>
+      <w:r>
+        <w:t>$acl.SetAccessRuleProtection($true, $false)</w:t>
+      </w:r>
+    </w:p>
+    <w:p>
+      <w:r>
+        <w:t>$rule = New-Object System.Security.AccessControl.FileSystemAccessRule("DERBY\DerbyAccessGroup", "Modify", "ContainerInherit,ObjectInherit", "None", "Allow")</w:t>
+      </w:r>
+    </w:p>
+    <w:p>
+      <w:r>
+        <w:t>$acl.AddAccessRule($rule)</w:t>
+      </w:r>
+    </w:p>
+    <w:p>
+      <w:r>
+        <w:t>Set-Acl -Path "C:\Shares\Confidential" -AclObject $acl</w:t>
+      </w:r>
+    </w:p>
+    <w:p>
+      <w:r>
+        <w:t>New-SmbShare -Name "Confidential" -Path "C:\Shares\Confidential" -FullAccess "DERBY\DerbyAccessGroup"</w:t>
+      </w:r>
+    </w:p>
+    <w:p/>
+    <w:p>
+      <w:r>
+        <w:t>7.Join WinClient to domain and see if it works and test etc (see section 7.)</w:t>
       </w:r>
     </w:p>
     <w:p/>
@@ -1316,23 +602,7 @@
     <w:p>
       <w:r>
         <w:lastRenderedPageBreak/>
-        <w:t xml:space="preserve">Cross domain access tests </w:t>
-      </w:r>
-      <w:proofErr w:type="spellStart"/>
-      <w:r>
-        <w:t>demonstrate's</w:t>
-      </w:r>
-      <w:proofErr w:type="spellEnd"/>
-      <w:r>
-        <w:t xml:space="preserve"> Derby user (within </w:t>
-      </w:r>
-      <w:proofErr w:type="spellStart"/>
-      <w:r>
-        <w:t>DerbyAccessGroup</w:t>
-      </w:r>
-      <w:proofErr w:type="spellEnd"/>
-      <w:r>
-        <w:t>) can enter \DC-DERBY\Confidential, and that Bolton user that isn't in the group is denied which shows the domain security boundary is built.</w:t>
+        <w:t>Cross domain access tests demonstrate's Derby user (within DerbyAccessGroup) can enter \DC-DERBY\Confidential, and that Bolton user that isn't in the group is denied which shows the domain security boundary is built.</w:t>
       </w:r>
     </w:p>
     <w:p/>
@@ -1367,23 +637,7 @@
     <w:p/>
     <w:p>
       <w:r>
-        <w:t xml:space="preserve">The main </w:t>
-      </w:r>
-      <w:proofErr w:type="spellStart"/>
-      <w:r>
-        <w:t>trade offs</w:t>
-      </w:r>
-      <w:proofErr w:type="spellEnd"/>
-      <w:r>
-        <w:t xml:space="preserve">: using a single domain controller and relying on a lab only DNS and using generic passwords wouldn't be acceptable in a real situation / deployment but in this </w:t>
-      </w:r>
-      <w:proofErr w:type="gramStart"/>
-      <w:r>
-        <w:t>assignment</w:t>
-      </w:r>
-      <w:proofErr w:type="gramEnd"/>
-      <w:r>
-        <w:t xml:space="preserve"> it is within scope.</w:t>
+        <w:t>The main trade offs: using a single domain controller and relying on a lab only DNS and using generic passwords wouldn't be acceptable in a real situation / deployment but in this assignment it is within scope.</w:t>
       </w:r>
     </w:p>
     <w:p/>
@@ -1415,28 +669,12 @@
     </w:p>
     <w:p>
       <w:r>
-        <w:t xml:space="preserve">Risk: users could use </w:t>
-      </w:r>
-      <w:proofErr w:type="spellStart"/>
-      <w:r>
-        <w:t>cmd</w:t>
-      </w:r>
-      <w:proofErr w:type="spellEnd"/>
-      <w:r>
-        <w:t xml:space="preserve"> tools to bypass security or access could lead to an attack surface.</w:t>
-      </w:r>
-    </w:p>
-    <w:p>
-      <w:r>
-        <w:t xml:space="preserve">Control: disabled access to </w:t>
-      </w:r>
-      <w:proofErr w:type="spellStart"/>
-      <w:r>
-        <w:t>cmd</w:t>
-      </w:r>
-      <w:proofErr w:type="spellEnd"/>
-      <w:r>
-        <w:t xml:space="preserve"> so users can't run cmd.exe and batch scripts.</w:t>
+        <w:t>Risk: users could use cmd tools to bypass security or access could lead to an attack surface.</w:t>
+      </w:r>
+    </w:p>
+    <w:p>
+      <w:r>
+        <w:t>Control: disabled access to cmd so users can't run cmd.exe and batch scripts.</w:t>
       </w:r>
     </w:p>
     <w:p>
@@ -1464,29 +702,13 @@
     <w:p/>
     <w:p>
       <w:r>
-        <w:t>Domain controller health (Bolton) "\Evidence\</w:t>
-      </w:r>
-      <w:proofErr w:type="spellStart"/>
-      <w:r>
-        <w:t>HealthChecks</w:t>
-      </w:r>
-      <w:proofErr w:type="spellEnd"/>
-      <w:r>
-        <w:t>\dcdiag_Bolton.txt"</w:t>
-      </w:r>
-    </w:p>
-    <w:p/>
-    <w:p>
-      <w:r>
-        <w:t>Domain controller health (Derby) "\Evidence\</w:t>
-      </w:r>
-      <w:proofErr w:type="spellStart"/>
-      <w:r>
-        <w:t>HealthChecks</w:t>
-      </w:r>
-      <w:proofErr w:type="spellEnd"/>
-      <w:r>
-        <w:t>\dcdiag_Derby.txt"</w:t>
+        <w:t>Domain controller health (Bolton) "\Evidence\HealthChecks\dcdiag_Bolton.txt"</w:t>
+      </w:r>
+    </w:p>
+    <w:p/>
+    <w:p>
+      <w:r>
+        <w:t>Domain controller health (Derby) "\Evidence\HealthChecks\dcdiag_Derby.txt"</w:t>
       </w:r>
     </w:p>
     <w:p/>
@@ -1544,15 +766,7 @@
     <w:p/>
     <w:p>
       <w:r>
-        <w:t xml:space="preserve">Ubuntu has valid </w:t>
-      </w:r>
-      <w:proofErr w:type="spellStart"/>
-      <w:r>
-        <w:t>keytab</w:t>
-      </w:r>
-      <w:proofErr w:type="spellEnd"/>
-      <w:r>
-        <w:t xml:space="preserve"> "\Evidence/Screenshots/Ubuntu_Keytab.png"</w:t>
+        <w:t>Ubuntu has valid keytab "\Evidence/Screenshots/Ubuntu_Keytab.png"</w:t>
       </w:r>
     </w:p>
     <w:p/>
@@ -1564,15 +778,7 @@
     <w:p/>
     <w:p>
       <w:r>
-        <w:t xml:space="preserve">Windows server prevented access to </w:t>
-      </w:r>
-      <w:proofErr w:type="spellStart"/>
-      <w:r>
-        <w:t>cmd</w:t>
-      </w:r>
-      <w:proofErr w:type="spellEnd"/>
-      <w:r>
-        <w:t xml:space="preserve"> prompt "\Evidence\Screenshots\Windows_server_prevent_cmd.png"</w:t>
+        <w:t>Windows server prevented access to cmd prompt "\Evidence\Screenshots\Windows_server_prevent_cmd.png"</w:t>
       </w:r>
     </w:p>
     <w:p/>
@@ -1608,21 +814,37 @@
     <w:p/>
     <w:p>
       <w:r>
+        <w:t>GitHub repository link ("\Evidence\Git\RepoLink.txt")</w:t>
+      </w:r>
+    </w:p>
+    <w:p/>
+    <w:p>
+      <w:r>
+        <w:t xml:space="preserve"> Git commit history ("\Evidence\Git\GitLog.txt")</w:t>
+      </w:r>
+    </w:p>
+    <w:p/>
+    <w:p>
+      <w:r>
+        <w:t>Git contribution stats ("\Evidence\Git\Stats.txt")</w:t>
+      </w:r>
+    </w:p>
+    <w:p/>
+    <w:p>
+      <w:r>
+        <w:t>Development reflogs ("\Evidence\Git\Reflog\")</w:t>
+      </w:r>
+    </w:p>
+    <w:p>
+      <w:r>
+        <w:lastRenderedPageBreak/>
         <w:t>10. Limitations</w:t>
       </w:r>
     </w:p>
     <w:p/>
     <w:p>
       <w:r>
-        <w:t xml:space="preserve">Single domain controllers – in a </w:t>
-      </w:r>
-      <w:proofErr w:type="gramStart"/>
-      <w:r>
-        <w:t>real life</w:t>
-      </w:r>
-      <w:proofErr w:type="gramEnd"/>
-      <w:r>
-        <w:t xml:space="preserve"> production at least 2 DCs would be needed</w:t>
+        <w:t>Single domain controllers – in a real life production at least 2 DCs would be needed</w:t>
       </w:r>
     </w:p>
     <w:p/>
@@ -1634,22 +856,13 @@
     <w:p/>
     <w:p>
       <w:r>
-        <w:lastRenderedPageBreak/>
         <w:t>DNS delegation – warnings were ignored as parent zone didn't exist externally</w:t>
       </w:r>
     </w:p>
     <w:p/>
     <w:p>
       <w:r>
-        <w:t xml:space="preserve">Manual promotion – the initial build was made </w:t>
-      </w:r>
-      <w:proofErr w:type="gramStart"/>
-      <w:r>
-        <w:t>manually</w:t>
-      </w:r>
-      <w:proofErr w:type="gramEnd"/>
-      <w:r>
-        <w:t xml:space="preserve"> and automation would be needed for repeatability</w:t>
+        <w:t>Manual promotion – the initial build was made manually and automation would be needed for repeatability</w:t>
       </w:r>
     </w:p>
     <w:p/>
@@ -1661,15 +874,7 @@
     <w:p/>
     <w:p>
       <w:r>
-        <w:t xml:space="preserve">Passwords – most passwords were generic; in a </w:t>
-      </w:r>
-      <w:proofErr w:type="gramStart"/>
-      <w:r>
-        <w:t>real life</w:t>
-      </w:r>
-      <w:proofErr w:type="gramEnd"/>
-      <w:r>
-        <w:t xml:space="preserve"> situation would need stronger passwords</w:t>
+        <w:t>Passwords – most passwords were generic; in a real life situation would need stronger passwords</w:t>
       </w:r>
     </w:p>
     <w:p/>
@@ -1687,43 +892,19 @@
     <w:p/>
     <w:p>
       <w:r>
-        <w:t>Microsoft Corporation (2024) Install-</w:t>
-      </w:r>
-      <w:proofErr w:type="spellStart"/>
-      <w:r>
-        <w:t>ADDSForest</w:t>
-      </w:r>
-      <w:proofErr w:type="spellEnd"/>
-      <w:r>
-        <w:t>. Available at: https://learn.microsoft.com/en-us/powershell/module/addsdeployment/install-addsforest (Accessed: 22 February 2026).</w:t>
-      </w:r>
-    </w:p>
-    <w:p/>
-    <w:p>
-      <w:r>
-        <w:t>Microsoft Corporation (2024) Install-</w:t>
-      </w:r>
-      <w:proofErr w:type="spellStart"/>
-      <w:r>
-        <w:t>ADDSDomain</w:t>
-      </w:r>
-      <w:proofErr w:type="spellEnd"/>
-      <w:r>
-        <w:t>. Available at: https://learn.microsoft.com/en-us/powershell/module/addsdeployment/install-addsdomain (Accessed: 22 February 2026).</w:t>
-      </w:r>
-    </w:p>
-    <w:p/>
-    <w:p>
-      <w:r>
-        <w:t>Microsoft Corporation (2024) New-</w:t>
-      </w:r>
-      <w:proofErr w:type="spellStart"/>
-      <w:r>
-        <w:t>SmbShare</w:t>
-      </w:r>
-      <w:proofErr w:type="spellEnd"/>
-      <w:r>
-        <w:t>. Available at: https://learn.microsoft.com/en-us/powershell/module/smbshare/new-smbshare (Accessed: 22 February 2026).</w:t>
+        <w:t>Microsoft Corporation (2024) Install-ADDSForest. Available at: https://learn.microsoft.com/en-us/powershell/module/addsdeployment/install-addsforest (Accessed: 22 February 2026).</w:t>
+      </w:r>
+    </w:p>
+    <w:p/>
+    <w:p>
+      <w:r>
+        <w:t>Microsoft Corporation (2024) Install-ADDSDomain. Available at: https://learn.microsoft.com/en-us/powershell/module/addsdeployment/install-addsdomain (Accessed: 22 February 2026).</w:t>
+      </w:r>
+    </w:p>
+    <w:p/>
+    <w:p>
+      <w:r>
+        <w:t>Microsoft Corporation (2024) New-SmbShare. Available at: https://learn.microsoft.com/en-us/powershell/module/smbshare/new-smbshare (Accessed: 22 February 2026).</w:t>
       </w:r>
     </w:p>
     <w:p/>
@@ -1747,15 +928,7 @@
     <w:p/>
     <w:p>
       <w:r>
-        <w:t xml:space="preserve">Ubuntu Community (2024) Active Directory authentication with SSSD and </w:t>
-      </w:r>
-      <w:proofErr w:type="spellStart"/>
-      <w:r>
-        <w:t>realmd</w:t>
-      </w:r>
-      <w:proofErr w:type="spellEnd"/>
-      <w:r>
-        <w:t>. Available at: https://ubuntu.com/server/docs/service-sssd-ad (Accessed: 22 February 2026).</w:t>
+        <w:t>Ubuntu Community (2024) Active Directory authentication with SSSD and realmd. Available at: https://ubuntu.com/server/docs/service-sssd-ad (Accessed: 22 February 2026).</w:t>
       </w:r>
     </w:p>
     <w:sectPr>

</xml_diff>

<commit_message>
Final Ubuntu user auth working – add screenshots
</commit_message>
<xml_diff>
--- a/BarmBuzz/Doccumentation/README.DOCX.DOCX
+++ b/BarmBuzz/Doccumentation/README.DOCX.DOCX
@@ -4,15 +4,12 @@
   <w:body>
     <w:p>
       <w:r>
-        <w:t xml:space="preserve">Barnbuzz Active Directory Implementation – Harry Corcoran </w:t>
-      </w:r>
-      <w:r>
-        <w:t>Student ID: 2403986</w:t>
-      </w:r>
-    </w:p>
-    <w:p>
-      <w:r>
-        <w:t>1. Solution</w:t>
+        <w:t>Barnbuzz Active Directory Implementation</w:t>
+      </w:r>
+    </w:p>
+    <w:p>
+      <w:r>
+        <w:t xml:space="preserve">1. Solution **This ZIP matches the repository as of 2026-02-23 </w:t>
       </w:r>
     </w:p>
     <w:p/>
@@ -24,19 +21,19 @@
     <w:p/>
     <w:p>
       <w:r>
-        <w:t>Root Domain: 'bolton.local'</w:t>
-      </w:r>
-    </w:p>
-    <w:p/>
-    <w:p>
-      <w:r>
-        <w:t>Child Domain: 'derby.bolton.local'</w:t>
-      </w:r>
-    </w:p>
-    <w:p/>
-    <w:p>
-      <w:r>
-        <w:t>Organisational unit: 'Nottingham' inside Derby</w:t>
+        <w:t xml:space="preserve">    Root Domain: 'bolton.local'</w:t>
+      </w:r>
+    </w:p>
+    <w:p/>
+    <w:p>
+      <w:r>
+        <w:t xml:space="preserve">    Child Domain: 'derby.bolton.local'</w:t>
+      </w:r>
+    </w:p>
+    <w:p/>
+    <w:p>
+      <w:r>
+        <w:t xml:space="preserve">    Organisational unit: 'Nottingham' inside Derby</w:t>
       </w:r>
     </w:p>
     <w:p/>
@@ -59,19 +56,19 @@
     <w:p/>
     <w:p>
       <w:r>
-        <w:t>'bolton.local' is the company's HQ</w:t>
-      </w:r>
-    </w:p>
-    <w:p/>
-    <w:p>
-      <w:r>
-        <w:t>'derby.bolton.local' is the child domain with delegated administration</w:t>
-      </w:r>
-    </w:p>
-    <w:p/>
-    <w:p>
-      <w:r>
-        <w:t>'Nottingham' OU is within the Derby domain for local applications of the policy I have set out</w:t>
+        <w:t xml:space="preserve">    'bolton.local' is the company's HQ</w:t>
+      </w:r>
+    </w:p>
+    <w:p/>
+    <w:p>
+      <w:r>
+        <w:t xml:space="preserve">    'derby.bolton.local' is the child domain with delegated administration</w:t>
+      </w:r>
+    </w:p>
+    <w:p/>
+    <w:p>
+      <w:r>
+        <w:t xml:space="preserve">    'Nottingham' OU is within the Derby domain for local applications of the policy I have set out</w:t>
       </w:r>
     </w:p>
     <w:p/>
@@ -90,13 +87,13 @@
     <w:p/>
     <w:p>
       <w:r>
-        <w:t>'BoltonUsers' – contains users from root forest domain</w:t>
-      </w:r>
-    </w:p>
-    <w:p/>
-    <w:p>
-      <w:r>
-        <w:t>'DerbyAccessGroup' – controls access to Derby file shares</w:t>
+        <w:t xml:space="preserve">    'BoltonUsers' – contains users from root forest domain</w:t>
+      </w:r>
+    </w:p>
+    <w:p/>
+    <w:p>
+      <w:r>
+        <w:t xml:space="preserve">    'DerbyAccessGroup' – controls access to Derby file shares</w:t>
       </w:r>
     </w:p>
     <w:p/>
@@ -114,25 +111,25 @@
     <w:p/>
     <w:p>
       <w:r>
-        <w:t>DSC configurations will define domain controllers, users, groups, GPOs and OUs</w:t>
-      </w:r>
-    </w:p>
-    <w:p/>
-    <w:p>
-      <w:r>
-        <w:t>data file in 'DSC/Data' will push user and group creation</w:t>
-      </w:r>
-    </w:p>
-    <w:p/>
-    <w:p>
-      <w:r>
-        <w:t>scripts within 'DSC/Scripts/' will make sure correct build order occurs</w:t>
-      </w:r>
-    </w:p>
-    <w:p/>
-    <w:p>
-      <w:r>
-        <w:t>MOF files shouldn't be modified as they are generated artefacts</w:t>
+        <w:t xml:space="preserve">    DSC configurations will define domain controllers, users, groups, GPOs and OUs</w:t>
+      </w:r>
+    </w:p>
+    <w:p/>
+    <w:p>
+      <w:r>
+        <w:t xml:space="preserve">    data file in 'DSC/Data' will push user and group creation</w:t>
+      </w:r>
+    </w:p>
+    <w:p/>
+    <w:p>
+      <w:r>
+        <w:t xml:space="preserve">    scripts within 'DSC/Scripts/' will make sure correct build order occurs</w:t>
+      </w:r>
+    </w:p>
+    <w:p/>
+    <w:p>
+      <w:r>
+        <w:t xml:space="preserve">    MOF files shouldn't be modified as they are generated artefacts</w:t>
       </w:r>
     </w:p>
     <w:p/>
@@ -298,6 +295,9 @@
     </w:p>
     <w:p>
       <w:r>
+        <w:t xml:space="preserve">    </w:t>
+      </w:r>
+      <w:r>
         <w:rPr>
           <w:rFonts w:ascii="MS Gothic" w:eastAsia="MS Gothic" w:hAnsi="MS Gothic" w:cs="MS Gothic" w:hint="eastAsia"/>
         </w:rPr>
@@ -315,6 +315,9 @@
     </w:p>
     <w:p>
       <w:r>
+        <w:t xml:space="preserve">    </w:t>
+      </w:r>
+      <w:r>
         <w:rPr>
           <w:rFonts w:ascii="MS Gothic" w:eastAsia="MS Gothic" w:hAnsi="MS Gothic" w:cs="MS Gothic" w:hint="eastAsia"/>
         </w:rPr>
@@ -332,6 +335,9 @@
     </w:p>
     <w:p>
       <w:r>
+        <w:t xml:space="preserve">    </w:t>
+      </w:r>
+      <w:r>
         <w:rPr>
           <w:rFonts w:ascii="MS Gothic" w:eastAsia="MS Gothic" w:hAnsi="MS Gothic" w:cs="MS Gothic" w:hint="eastAsia"/>
         </w:rPr>
@@ -349,6 +355,9 @@
     </w:p>
     <w:p>
       <w:r>
+        <w:t xml:space="preserve">    </w:t>
+      </w:r>
+      <w:r>
         <w:rPr>
           <w:rFonts w:ascii="MS Gothic" w:eastAsia="MS Gothic" w:hAnsi="MS Gothic" w:cs="MS Gothic" w:hint="eastAsia"/>
         </w:rPr>
@@ -366,6 +375,9 @@
     </w:p>
     <w:p>
       <w:r>
+        <w:t xml:space="preserve">    </w:t>
+      </w:r>
+      <w:r>
         <w:rPr>
           <w:rFonts w:ascii="MS Gothic" w:eastAsia="MS Gothic" w:hAnsi="MS Gothic" w:cs="MS Gothic" w:hint="eastAsia"/>
         </w:rPr>
@@ -383,7 +395,7 @@
     </w:p>
     <w:p>
       <w:r>
-        <w:t>└── AI_Log/</w:t>
+        <w:t xml:space="preserve">    └── AI_Log/</w:t>
       </w:r>
     </w:p>
     <w:p/>
@@ -412,19 +424,19 @@
     <w:p/>
     <w:p>
       <w:r>
-        <w:t>DC-BOLTON: '192.168.50.1'</w:t>
-      </w:r>
-    </w:p>
-    <w:p/>
-    <w:p>
-      <w:r>
-        <w:t>DC-DERBY: '192.168.50.2'</w:t>
-      </w:r>
-    </w:p>
-    <w:p/>
-    <w:p>
-      <w:r>
-        <w:t>WinClient: '192.168.50.100' (static or DHCP reserved also works)</w:t>
+        <w:t xml:space="preserve">        DC-BOLTON: '192.168.50.1'</w:t>
+      </w:r>
+    </w:p>
+    <w:p/>
+    <w:p>
+      <w:r>
+        <w:t xml:space="preserve">        DC-DERBY: '192.168.50.2'</w:t>
+      </w:r>
+    </w:p>
+    <w:p/>
+    <w:p>
+      <w:r>
+        <w:t xml:space="preserve">        WinClient: '192.168.50.100' (static or DHCP reserved also works)</w:t>
       </w:r>
     </w:p>
     <w:p/>
@@ -690,68 +702,68 @@
     <w:p/>
     <w:p>
       <w:r>
-        <w:t>Derby can enter shared files ("\Evidence\Screenshots\DerbyUser_Success.png")</w:t>
-      </w:r>
-    </w:p>
-    <w:p/>
-    <w:p>
-      <w:r>
-        <w:t>Bolton user can't access ("\Evidence\Screenshots\BoltonUser_Denied.png")</w:t>
-      </w:r>
-    </w:p>
-    <w:p/>
-    <w:p>
-      <w:r>
-        <w:t>Domain controller health (Bolton) "\Evidence\HealthChecks\dcdiag_Bolton.txt"</w:t>
-      </w:r>
-    </w:p>
-    <w:p/>
-    <w:p>
-      <w:r>
-        <w:t>Domain controller health (Derby) "\Evidence\HealthChecks\dcdiag_Derby.txt"</w:t>
-      </w:r>
-    </w:p>
-    <w:p/>
-    <w:p>
-      <w:r>
-        <w:t>Child domain exists "\Evidence\Screenshots\ADUC_Derby.png"</w:t>
-      </w:r>
-    </w:p>
-    <w:p/>
-    <w:p>
-      <w:r>
-        <w:t>Nottingham OU exists "\Evidence\Screenshots\Nottingham_OU.png"</w:t>
-      </w:r>
-    </w:p>
-    <w:p/>
-    <w:p>
-      <w:r>
-        <w:t>FGPP made "\Evidence\Screenshots\FGPP_Creation.png"</w:t>
-      </w:r>
-    </w:p>
-    <w:p/>
-    <w:p>
-      <w:r>
-        <w:t>FGPP Applied to domain services "\Evidence\Screenshots\FGPP_ApplyToAdmins.png"</w:t>
-      </w:r>
-    </w:p>
-    <w:p/>
-    <w:p>
-      <w:r>
-        <w:t>FGPP effective for privileged users "\Evidence\Screenshots\FGPP_AdminResult.png"</w:t>
-      </w:r>
-    </w:p>
-    <w:p/>
-    <w:p>
-      <w:r>
-        <w:t>FGPP not effective for normal users "\Evidence\Screenshots\FGPP_UserResult.png"</w:t>
+        <w:t xml:space="preserve">    Derby can enter shared files ("\Evidence\Screenshots\DerbyUser_Success.png")</w:t>
+      </w:r>
+    </w:p>
+    <w:p/>
+    <w:p>
+      <w:r>
+        <w:t xml:space="preserve">    Bolton user can't access ("\Evidence\Screenshots\BoltonUser_Denied.png")</w:t>
+      </w:r>
+    </w:p>
+    <w:p/>
+    <w:p>
+      <w:r>
+        <w:t xml:space="preserve">    Domain controller health (Bolton) "\Evidence\HealthChecks\dcdiag_Bolton.txt"</w:t>
+      </w:r>
+    </w:p>
+    <w:p/>
+    <w:p>
+      <w:r>
+        <w:t xml:space="preserve">    Domain controller health (Derby) "\Evidence\HealthChecks\dcdiag_Derby.txt"</w:t>
+      </w:r>
+    </w:p>
+    <w:p/>
+    <w:p>
+      <w:r>
+        <w:t xml:space="preserve">    Child domain exists "\Evidence\Screenshots\ADUC_Derby.png"</w:t>
+      </w:r>
+    </w:p>
+    <w:p/>
+    <w:p>
+      <w:r>
+        <w:t xml:space="preserve">    Nottingham OU exists "\Evidence\Screenshots\Nottingham_OU.png"</w:t>
+      </w:r>
+    </w:p>
+    <w:p/>
+    <w:p>
+      <w:r>
+        <w:t xml:space="preserve">    FGPP made "\Evidence\Screenshots\FGPP_Creation.png"</w:t>
+      </w:r>
+    </w:p>
+    <w:p/>
+    <w:p>
+      <w:r>
+        <w:t xml:space="preserve">    FGPP Applied to domain services "\Evidence\Screenshots\FGPP_ApplyToAdmins.png"</w:t>
+      </w:r>
+    </w:p>
+    <w:p/>
+    <w:p>
+      <w:r>
+        <w:t xml:space="preserve">    FGPP effective for privileged users "\Evidence\Screenshots\FGPP_AdminResult.png"</w:t>
+      </w:r>
+    </w:p>
+    <w:p/>
+    <w:p>
+      <w:r>
+        <w:t xml:space="preserve">    FGPP not effective for normal users "\Evidence\Screenshots\FGPP_UserResult.png"</w:t>
       </w:r>
     </w:p>
     <w:p/>
     <w:p>
       <w:r>
         <w:lastRenderedPageBreak/>
-        <w:t>Ubuntu is domain</w:t>
+        <w:t xml:space="preserve">    Ubuntu is domain</w:t>
       </w:r>
       <w:r>
         <w:rPr>
@@ -766,132 +778,157 @@
     <w:p/>
     <w:p>
       <w:r>
-        <w:t>Ubuntu has valid keytab "\Evidence/Screenshots/Ubuntu_Keytab.png"</w:t>
-      </w:r>
-    </w:p>
-    <w:p/>
-    <w:p>
-      <w:r>
-        <w:t>Ubuntu computer object exists in AD "\Evidence/Screenshots/Ubuntu_ADUC.png"</w:t>
-      </w:r>
-    </w:p>
-    <w:p/>
-    <w:p>
-      <w:r>
-        <w:t>Windows server prevented access to cmd prompt "\Evidence\Screenshots\Windows_server_prevent_cmd.png"</w:t>
-      </w:r>
-    </w:p>
-    <w:p/>
-    <w:p>
-      <w:r>
-        <w:t>Nottingham OU management policy "\Evidence\Screenshots\Policy_management_linked.png"</w:t>
-      </w:r>
-    </w:p>
-    <w:p/>
-    <w:p>
-      <w:r>
-        <w:t>Command prompt disabled on Nottingham user "\Evidence\Screenshots\Commandpromptdisabled.png"</w:t>
-      </w:r>
-    </w:p>
-    <w:p/>
-    <w:p>
-      <w:r>
-        <w:t>Control panel disabled on Nottingham user "\Evidence\Screenshots\Controlpaneldisabled.png"</w:t>
-      </w:r>
-    </w:p>
-    <w:p/>
-    <w:p>
-      <w:r>
-        <w:t>GP report of Nottingham user "\Evidence\Screenshots\GPRnottinghamuser.png"</w:t>
-      </w:r>
-    </w:p>
-    <w:p/>
-    <w:p>
-      <w:r>
-        <w:t>Automated validation tests pass "\Evidence\Screenshots\Pester_Results.png"</w:t>
-      </w:r>
-    </w:p>
-    <w:p/>
-    <w:p>
-      <w:r>
-        <w:t>GitHub repository link ("\Evidence\Git\RepoLink.txt")</w:t>
-      </w:r>
-    </w:p>
-    <w:p/>
-    <w:p>
-      <w:r>
-        <w:t xml:space="preserve"> Git commit history ("\Evidence\Git\GitLog.txt")</w:t>
-      </w:r>
-    </w:p>
-    <w:p/>
-    <w:p>
-      <w:r>
-        <w:t>Git contribution stats ("\Evidence\Git\Stats.txt")</w:t>
-      </w:r>
-    </w:p>
-    <w:p/>
-    <w:p>
-      <w:r>
-        <w:t>Development reflogs ("\Evidence\Git\Reflog\")</w:t>
-      </w:r>
-    </w:p>
+        <w:t xml:space="preserve">    Ubuntu has valid keytab "\Evidence/Screenshots/Ubuntu_Keytab.png"</w:t>
+      </w:r>
+    </w:p>
+    <w:p/>
+    <w:p>
+      <w:r>
+        <w:t xml:space="preserve">    Ubuntu computer object exists in AD "\Evidence/Screenshots/Ubuntu_ADUC.png"</w:t>
+      </w:r>
+    </w:p>
+    <w:p>
+      <w:r>
+        <w:t xml:space="preserve">    Ubuntu Ubuntu ID Use rand Getent "\Evidence\Screenshots\Ubuntu_ID_User_and_Getent.png"</w:t>
+      </w:r>
+    </w:p>
+    <w:p>
+      <w:r>
+        <w:t xml:space="preserve"> </w:t>
+      </w:r>
+    </w:p>
+    <w:p>
+      <w:r>
+        <w:t xml:space="preserve">    Windows server prevented access to cmd prompt "\Evidence\Screenshots\Windows_server_prevent_cmd.png"</w:t>
+      </w:r>
+    </w:p>
+    <w:p/>
+    <w:p>
+      <w:r>
+        <w:t xml:space="preserve">    Nottingham OU management policy "\Evidence\Screenshots\Policy_management_linked.png"</w:t>
+      </w:r>
+    </w:p>
+    <w:p/>
+    <w:p>
+      <w:r>
+        <w:t xml:space="preserve">    Command prompt disabled on Nottingham user "\Evidence\Screenshots\Commandpromptdisabled.png"</w:t>
+      </w:r>
+    </w:p>
+    <w:p/>
+    <w:p>
+      <w:r>
+        <w:t xml:space="preserve">    Control panel disabled on Nottingham user "\Evidence\Screenshots\Controlpaneldisabled.png"</w:t>
+      </w:r>
+    </w:p>
+    <w:p/>
+    <w:p>
+      <w:r>
+        <w:t xml:space="preserve">    GP report of Nottingham user "\Evidence\Screenshots\GPRnottinghamuser.png"</w:t>
+      </w:r>
+    </w:p>
+    <w:p/>
+    <w:p>
+      <w:r>
+        <w:t xml:space="preserve">    Automated validation tests pass "\Evidence\Screenshots\Pester_Results.png"</w:t>
+      </w:r>
+    </w:p>
+    <w:p>
+      <w:r>
+        <w:tab/>
+        <w:t xml:space="preserve"> </w:t>
+      </w:r>
+    </w:p>
+    <w:p>
+      <w:r>
+        <w:t xml:space="preserve">    GitHub repository link ("\Evidence\Git\RepoLink.txt")</w:t>
+      </w:r>
+    </w:p>
+    <w:p/>
+    <w:p>
+      <w:r>
+        <w:t xml:space="preserve">    Git commit history ("\Evidence\Git\GitLog.txt")</w:t>
+      </w:r>
+    </w:p>
+    <w:p/>
+    <w:p>
+      <w:r>
+        <w:t xml:space="preserve">    Git contribution stats ("\Evidence\Git\Stats.txt")</w:t>
+      </w:r>
+    </w:p>
+    <w:p/>
+    <w:p>
+      <w:r>
+        <w:t xml:space="preserve">    Development reflogs ("\Evidence\Git\Reflog\")</w:t>
+      </w:r>
+    </w:p>
+    <w:p>
+      <w:r>
+        <w:tab/>
+      </w:r>
+    </w:p>
+    <w:p/>
+    <w:p>
+      <w:r>
+        <w:t>10. Limitations</w:t>
+      </w:r>
+    </w:p>
+    <w:p/>
+    <w:p>
+      <w:r>
+        <w:t xml:space="preserve">    Single domain controllers – in a real life production at least 2 DCs would be needed</w:t>
+      </w:r>
+    </w:p>
+    <w:p/>
+    <w:p>
+      <w:r>
+        <w:t xml:space="preserve">    Time sync problems – in a lab to be expected whereas in a real deployment time source would need external time source</w:t>
+      </w:r>
+    </w:p>
+    <w:p/>
+    <w:p>
+      <w:r>
+        <w:t xml:space="preserve">    DNS delegation – warnings were ignored as parent zone didn't exist externally</w:t>
+      </w:r>
+    </w:p>
+    <w:p/>
+    <w:p>
+      <w:r>
+        <w:t xml:space="preserve">    Manual promotion – the initial build was made manually and automation would be needed for repeatability</w:t>
+      </w:r>
+    </w:p>
+    <w:p/>
+    <w:p>
+      <w:r>
+        <w:t xml:space="preserve">    Disabling IPv6 to avoid DNS problems – in a real situation IPv6 would require planning to work</w:t>
+      </w:r>
+    </w:p>
+    <w:p/>
+    <w:p>
+      <w:r>
+        <w:t xml:space="preserve">    Passwords – most passwords were generic; in a real life situation would need stronger passwords</w:t>
+      </w:r>
+    </w:p>
+    <w:p/>
+    <w:p>
+      <w:r>
+        <w:t xml:space="preserve"> </w:t>
+      </w:r>
+    </w:p>
+    <w:p>
+      <w:r>
+        <w:t>References</w:t>
+      </w:r>
+    </w:p>
+    <w:p/>
+    <w:p>
+      <w:r>
+        <w:t>Microsoft Corporation (2024) Active Directory Domain Services Overview. Available at: https://learn.microsoft.com/en-us/windows-server/identity/ad-ds/get-started/virtual-dc/active-directory-domain-services-overview (Accessed: 22 February 2026).</w:t>
+      </w:r>
+    </w:p>
+    <w:p/>
     <w:p>
       <w:r>
         <w:lastRenderedPageBreak/>
-        <w:t>10. Limitations</w:t>
-      </w:r>
-    </w:p>
-    <w:p/>
-    <w:p>
-      <w:r>
-        <w:t>Single domain controllers – in a real life production at least 2 DCs would be needed</w:t>
-      </w:r>
-    </w:p>
-    <w:p/>
-    <w:p>
-      <w:r>
-        <w:t>Time sync problems – in a lab to be expected whereas in a real deployment time source would need external time source</w:t>
-      </w:r>
-    </w:p>
-    <w:p/>
-    <w:p>
-      <w:r>
-        <w:t>DNS delegation – warnings were ignored as parent zone didn't exist externally</w:t>
-      </w:r>
-    </w:p>
-    <w:p/>
-    <w:p>
-      <w:r>
-        <w:t>Manual promotion – the initial build was made manually and automation would be needed for repeatability</w:t>
-      </w:r>
-    </w:p>
-    <w:p/>
-    <w:p>
-      <w:r>
-        <w:t>Disabling IPv6 to avoid DNS problems – in a real situation IPv6 would require planning to work</w:t>
-      </w:r>
-    </w:p>
-    <w:p/>
-    <w:p>
-      <w:r>
-        <w:t>Passwords – most passwords were generic; in a real life situation would need stronger passwords</w:t>
-      </w:r>
-    </w:p>
-    <w:p/>
-    <w:p>
-      <w:r>
-        <w:t>References</w:t>
-      </w:r>
-    </w:p>
-    <w:p/>
-    <w:p>
-      <w:r>
-        <w:t>Microsoft Corporation (2024) Active Directory Domain Services Overview. Available at: https://learn.microsoft.com/en-us/windows-server/identity/ad-ds/get-started/virtual-dc/active-directory-domain-services-overview (Accessed: 22 February 2026).</w:t>
-      </w:r>
-    </w:p>
-    <w:p/>
-    <w:p>
-      <w:r>
         <w:t>Microsoft Corporation (2024) Install-ADDSForest. Available at: https://learn.microsoft.com/en-us/powershell/module/addsdeployment/install-addsforest (Accessed: 22 February 2026).</w:t>
       </w:r>
     </w:p>

</xml_diff>